<commit_message>
Added papers and ideas Christian 26_04_2026
</commit_message>
<xml_diff>
--- a/Documentation/Progress & Ideas/Ideas & Progress.docx
+++ b/Documentation/Progress & Ideas/Ideas & Progress.docx
@@ -1,6 +1,6 @@
 
 <file path=word/document.xml><?xml version="1.0" encoding="utf-8"?>
-<w:document xmlns:wpc="http://schemas.microsoft.com/office/word/2010/wordprocessingCanvas" xmlns:cx="http://schemas.microsoft.com/office/drawing/2014/chartex" xmlns:cx1="http://schemas.microsoft.com/office/drawing/2015/9/8/chartex" xmlns:mc="http://schemas.openxmlformats.org/markup-compatibility/2006" xmlns:o="urn:schemas-microsoft-com:office:office" xmlns:r="http://schemas.openxmlformats.org/officeDocument/2006/relationships" xmlns:m="http://schemas.openxmlformats.org/officeDocument/2006/math" xmlns:v="urn:schemas-microsoft-com:vml" xmlns:wp14="http://schemas.microsoft.com/office/word/2010/wordprocessingDrawing" xmlns:wp="http://schemas.openxmlformats.org/drawingml/2006/wordprocessingDrawing" xmlns:w10="urn:schemas-microsoft-com:office:word" xmlns:w="http://schemas.openxmlformats.org/wordprocessingml/2006/main" xmlns:w14="http://schemas.microsoft.com/office/word/2010/wordml" xmlns:w15="http://schemas.microsoft.com/office/word/2012/wordml" xmlns:w16se="http://schemas.microsoft.com/office/word/2015/wordml/symex" xmlns:wpg="http://schemas.microsoft.com/office/word/2010/wordprocessingGroup" xmlns:wpi="http://schemas.microsoft.com/office/word/2010/wordprocessingInk" xmlns:wne="http://schemas.microsoft.com/office/word/2006/wordml" xmlns:wps="http://schemas.microsoft.com/office/word/2010/wordprocessingShape" mc:Ignorable="w14 w15 w16se wp14">
+<w:document xmlns:wpc="http://schemas.microsoft.com/office/word/2010/wordprocessingCanvas" xmlns:cx="http://schemas.microsoft.com/office/drawing/2014/chartex" xmlns:cx1="http://schemas.microsoft.com/office/drawing/2015/9/8/chartex" xmlns:cx2="http://schemas.microsoft.com/office/drawing/2015/10/21/chartex" xmlns:cx3="http://schemas.microsoft.com/office/drawing/2016/5/9/chartex" xmlns:cx4="http://schemas.microsoft.com/office/drawing/2016/5/10/chartex" xmlns:cx5="http://schemas.microsoft.com/office/drawing/2016/5/11/chartex" xmlns:cx6="http://schemas.microsoft.com/office/drawing/2016/5/12/chartex" xmlns:cx7="http://schemas.microsoft.com/office/drawing/2016/5/13/chartex" xmlns:cx8="http://schemas.microsoft.com/office/drawing/2016/5/14/chartex" xmlns:mc="http://schemas.openxmlformats.org/markup-compatibility/2006" xmlns:aink="http://schemas.microsoft.com/office/drawing/2016/ink" xmlns:am3d="http://schemas.microsoft.com/office/drawing/2017/model3d" xmlns:o="urn:schemas-microsoft-com:office:office" xmlns:oel="http://schemas.microsoft.com/office/2019/extlst" xmlns:r="http://schemas.openxmlformats.org/officeDocument/2006/relationships" xmlns:m="http://schemas.openxmlformats.org/officeDocument/2006/math" xmlns:v="urn:schemas-microsoft-com:vml" xmlns:wp14="http://schemas.microsoft.com/office/word/2010/wordprocessingDrawing" xmlns:wp="http://schemas.openxmlformats.org/drawingml/2006/wordprocessingDrawing" xmlns:w10="urn:schemas-microsoft-com:office:word" xmlns:w="http://schemas.openxmlformats.org/wordprocessingml/2006/main" xmlns:w14="http://schemas.microsoft.com/office/word/2010/wordml" xmlns:w15="http://schemas.microsoft.com/office/word/2012/wordml" xmlns:w16cex="http://schemas.microsoft.com/office/word/2018/wordml/cex" xmlns:w16cid="http://schemas.microsoft.com/office/word/2016/wordml/cid" xmlns:w16="http://schemas.microsoft.com/office/word/2018/wordml" xmlns:w16du="http://schemas.microsoft.com/office/word/2023/wordml/word16du" xmlns:w16sdtdh="http://schemas.microsoft.com/office/word/2020/wordml/sdtdatahash" xmlns:w16sdtfl="http://schemas.microsoft.com/office/word/2024/wordml/sdtformatlock" xmlns:w16se="http://schemas.microsoft.com/office/word/2015/wordml/symex" xmlns:wpg="http://schemas.microsoft.com/office/word/2010/wordprocessingGroup" xmlns:wpi="http://schemas.microsoft.com/office/word/2010/wordprocessingInk" xmlns:wne="http://schemas.microsoft.com/office/word/2006/wordml" xmlns:wps="http://schemas.microsoft.com/office/word/2010/wordprocessingShape" mc:Ignorable="w14 w15 w16se w16cid w16 w16cex w16sdtdh w16sdtfl w16du wp14">
   <w:body>
     <w:p>
       <w:pPr>
@@ -207,8 +207,6 @@
         </w:rPr>
         <w:t>, modality in inference experiment</w:t>
       </w:r>
-      <w:bookmarkStart w:id="0" w:name="_GoBack"/>
-      <w:bookmarkEnd w:id="0"/>
     </w:p>
     <w:p>
       <w:pPr>
@@ -506,6 +504,43 @@
           <w:lang w:val="en-US"/>
         </w:rPr>
         <w:t>5. use anchoring during the generation process (only in the case when diffusion is native), the noisy points near the ground truth(touch points) replace with the touch points to aid the diffusion process.</w:t>
+      </w:r>
+    </w:p>
+    <w:p>
+      <w:pPr>
+        <w:rPr>
+          <w:sz w:val="24"/>
+          <w:lang w:val="en-US"/>
+        </w:rPr>
+      </w:pPr>
+      <w:r>
+        <w:rPr>
+          <w:sz w:val="24"/>
+          <w:lang w:val="en-US"/>
+        </w:rPr>
+        <w:t>6. Apply ideas from DC-Compression Autoencoder to further accelerate training (residual autoencoder and latent refinement), evaluate its effect on generation quality, training and inference speed (Christian 26.04.2026)</w:t>
+      </w:r>
+    </w:p>
+    <w:p>
+      <w:pPr>
+        <w:rPr>
+          <w:sz w:val="24"/>
+          <w:lang w:val="en-US"/>
+        </w:rPr>
+      </w:pPr>
+      <w:r>
+        <w:rPr>
+          <w:sz w:val="24"/>
+          <w:lang w:val="en-US"/>
+        </w:rPr>
+        <w:t xml:space="preserve">7. </w:t>
+      </w:r>
+      <w:r>
+        <w:rPr>
+          <w:sz w:val="24"/>
+          <w:lang w:val="en-US"/>
+        </w:rPr>
+        <w:t>Transform contact points into world frame via forward kinematics into world frame to guide the diffusion process like in End-to-End Diffusion-based 3d reconstruction paper</w:t>
       </w:r>
     </w:p>
     <w:p>
@@ -527,7 +562,7 @@
 </file>
 
 <file path=word/styles.xml><?xml version="1.0" encoding="utf-8"?>
-<w:styles xmlns:mc="http://schemas.openxmlformats.org/markup-compatibility/2006" xmlns:r="http://schemas.openxmlformats.org/officeDocument/2006/relationships" xmlns:w="http://schemas.openxmlformats.org/wordprocessingml/2006/main" xmlns:w14="http://schemas.microsoft.com/office/word/2010/wordml" xmlns:w15="http://schemas.microsoft.com/office/word/2012/wordml" xmlns:w16se="http://schemas.microsoft.com/office/word/2015/wordml/symex" mc:Ignorable="w14 w15 w16se">
+<w:styles xmlns:mc="http://schemas.openxmlformats.org/markup-compatibility/2006" xmlns:r="http://schemas.openxmlformats.org/officeDocument/2006/relationships" xmlns:w="http://schemas.openxmlformats.org/wordprocessingml/2006/main" xmlns:w14="http://schemas.microsoft.com/office/word/2010/wordml" xmlns:w15="http://schemas.microsoft.com/office/word/2012/wordml" xmlns:w16cex="http://schemas.microsoft.com/office/word/2018/wordml/cex" xmlns:w16cid="http://schemas.microsoft.com/office/word/2016/wordml/cid" xmlns:w16="http://schemas.microsoft.com/office/word/2018/wordml" xmlns:w16du="http://schemas.microsoft.com/office/word/2023/wordml/word16du" xmlns:w16sdtdh="http://schemas.microsoft.com/office/word/2020/wordml/sdtdatahash" xmlns:w16sdtfl="http://schemas.microsoft.com/office/word/2024/wordml/sdtformatlock" xmlns:w16se="http://schemas.microsoft.com/office/word/2015/wordml/symex" mc:Ignorable="w14 w15 w16se w16cid w16 w16cex w16sdtdh w16sdtfl w16du">
   <w:docDefaults>
     <w:rPrDefault>
       <w:rPr>
@@ -543,7 +578,7 @@
       </w:pPr>
     </w:pPrDefault>
   </w:docDefaults>
-  <w:latentStyles w:defLockedState="0" w:defUIPriority="99" w:defSemiHidden="0" w:defUnhideWhenUsed="0" w:defQFormat="0" w:count="371">
+  <w:latentStyles w:defLockedState="0" w:defUIPriority="99" w:defSemiHidden="0" w:defUnhideWhenUsed="0" w:defQFormat="0" w:count="376">
     <w:lsdException w:name="Normal" w:uiPriority="0" w:qFormat="1"/>
     <w:lsdException w:name="heading 1" w:uiPriority="9" w:qFormat="1"/>
     <w:lsdException w:name="heading 2" w:semiHidden="1" w:uiPriority="9" w:unhideWhenUsed="1" w:qFormat="1"/>
@@ -915,21 +950,26 @@
     <w:lsdException w:name="List Table 5 Dark Accent 6" w:uiPriority="50"/>
     <w:lsdException w:name="List Table 6 Colorful Accent 6" w:uiPriority="51"/>
     <w:lsdException w:name="List Table 7 Colorful Accent 6" w:uiPriority="52"/>
+    <w:lsdException w:name="Mention" w:semiHidden="1" w:unhideWhenUsed="1"/>
+    <w:lsdException w:name="Smart Hyperlink" w:semiHidden="1" w:unhideWhenUsed="1"/>
+    <w:lsdException w:name="Hashtag" w:semiHidden="1" w:unhideWhenUsed="1"/>
+    <w:lsdException w:name="Unresolved Mention" w:semiHidden="1" w:unhideWhenUsed="1"/>
+    <w:lsdException w:name="Smart Link" w:semiHidden="1" w:unhideWhenUsed="1"/>
   </w:latentStyles>
-  <w:style w:type="paragraph" w:default="1" w:styleId="Normal">
+  <w:style w:type="paragraph" w:default="1" w:styleId="Standard">
     <w:name w:val="Normal"/>
     <w:qFormat/>
     <w:rPr>
       <w:lang w:val="de-DE"/>
     </w:rPr>
   </w:style>
-  <w:style w:type="character" w:default="1" w:styleId="DefaultParagraphFont">
+  <w:style w:type="character" w:default="1" w:styleId="Absatz-Standardschriftart">
     <w:name w:val="Default Paragraph Font"/>
     <w:uiPriority w:val="1"/>
     <w:semiHidden/>
     <w:unhideWhenUsed/>
   </w:style>
-  <w:style w:type="table" w:default="1" w:styleId="TableNormal">
+  <w:style w:type="table" w:default="1" w:styleId="NormaleTabelle">
     <w:name w:val="Normal Table"/>
     <w:uiPriority w:val="99"/>
     <w:semiHidden/>
@@ -944,7 +984,7 @@
       </w:tblCellMar>
     </w:tblPr>
   </w:style>
-  <w:style w:type="numbering" w:default="1" w:styleId="NoList">
+  <w:style w:type="numbering" w:default="1" w:styleId="KeineListe">
     <w:name w:val="No List"/>
     <w:uiPriority w:val="99"/>
     <w:semiHidden/>

</xml_diff>